<commit_message>
Updated study notes intros for 66 books in 7 languages with extensive content and metadata revisions
</commit_message>
<xml_diff>
--- a/eng/docx/31.content.docx
+++ b/eng/docx/31.content.docx
@@ -231,18 +231,7 @@
         <w:rPr>
           <w:lang w:val="en_US" w:bidi="en_US"/>
         </w:rPr>
-        <w:t>“Am I my brother’s keeper?” This ancient question, posed by Cain when the Lord inquired about his missing brother Abel, has become a metaphor for sidestepping responsibility. But Cain was in fact guilty of murdering his brother. Even to stand aloof when innocent people are violated is to share in the crime. Edom, a neighbor and relative of Judah, watched in delight and participated as Babylon destroyed Jerusalem. Now God would hold Edom accountable. God’s judgment always follows such injustice.</w:t>
-      </w:r>
-    </w:p>
-    <w:p>
-      <w:pPr>
-        <w:pStyle w:val="Heading2"/>
-      </w:pPr>
-      <w:r>
-        <w:rPr>
-          <w:lang w:val="en_US" w:bidi="en_US"/>
-        </w:rPr>
-        <w:t>Setting</w:t>
+        <w:t>Cain, one of the sons of Adam, asked, “Am I my brother’s keeper?” This question has become a picture of refusing responsibility. But Cain had murdered his brother Abel. A person also shares guilt by doing nothing when innocent people suffer.</w:t>
       </w:r>
     </w:p>
     <w:p>
@@ -256,7 +245,32 @@
         <w:rPr>
           <w:lang w:val="en_US" w:bidi="en_US"/>
         </w:rPr>
-        <w:t xml:space="preserve">The people of Edom were descended from Jacob’s brother, Esau (see </w:t>
+        <w:t>Edom was both Judah’s neighbor and relative. Yet Edom watched with delight and joined in when Babylon destroyed Jerusalem. So God held Edom responsible for this evil. God’s judgment always follows this kind of injustice.</w:t>
+      </w:r>
+    </w:p>
+    <w:p>
+      <w:pPr>
+        <w:pStyle w:val="Heading2"/>
+      </w:pPr>
+      <w:r>
+        <w:rPr>
+          <w:lang w:val="en_US" w:bidi="en_US"/>
+        </w:rPr>
+        <w:t>Setting</w:t>
+      </w:r>
+    </w:p>
+    <w:p>
+      <w:pPr/>
+      <w:r>
+        <w:rPr>
+          <w:lang w:val="en_US" w:bidi="en_US"/>
+        </w:rPr>
+      </w:r>
+      <w:r>
+        <w:rPr>
+          <w:lang w:val="en_US" w:bidi="en_US"/>
+        </w:rPr>
+        <w:t xml:space="preserve">The people of Edom came from Esau, the brother of Jacob (see </w:t>
       </w:r>
       <w:hyperlink r:id="rId13">
         <w:r>
@@ -267,14 +281,28 @@
             <w:color w:val="0000EE"/>
             <w:u w:val="single"/>
           </w:rPr>
-          <w:t>Gen 25:30</w:t>
+          <w:t>Genesis 25:30</w:t>
         </w:r>
       </w:hyperlink>
       <w:r>
         <w:rPr>
           <w:lang w:val="en_US" w:bidi="en_US"/>
         </w:rPr>
-        <w:t>). The Edomites mostly inhabited the highlands east of the Arabah and south of the Dead Sea. Edom existed throughout most of Israel’s monarchy (around 1050–586 BC) and was often a vassal to the southern kingdom of Judah (</w:t>
+        <w:t>). The Edomites lived mainly in the highlands (hill country) east of the Arabah (the Jordan Valley south of the Dead Sea) and south of the Dead Sea.</w:t>
+      </w:r>
+    </w:p>
+    <w:p>
+      <w:pPr/>
+      <w:r>
+        <w:rPr>
+          <w:lang w:val="en_US" w:bidi="en_US"/>
+        </w:rPr>
+      </w:r>
+      <w:r>
+        <w:rPr>
+          <w:lang w:val="en_US" w:bidi="en_US"/>
+        </w:rPr>
+        <w:t xml:space="preserve">Edom existed during most of the time of Israel’s kings (about 1050–586 BC). At times, Edom was under the control of the southern kingdom of Judah (this is called a vassal, meaning a smaller kingdom ruled by a stronger one; </w:t>
       </w:r>
       <w:hyperlink r:id="rId14">
         <w:r>
@@ -285,7 +313,7 @@
             <w:color w:val="0000EE"/>
             <w:u w:val="single"/>
           </w:rPr>
-          <w:t>2 Sam 8:14</w:t>
+          <w:t>2 Samuel 8:14</w:t>
         </w:r>
       </w:hyperlink>
       <w:r>
@@ -303,7 +331,7 @@
             <w:color w:val="0000EE"/>
             <w:u w:val="single"/>
           </w:rPr>
-          <w:t>1 Kgs 11:14–16</w:t>
+          <w:t>1 Kings 11:14–16</w:t>
         </w:r>
       </w:hyperlink>
       <w:r>
@@ -321,14 +349,14 @@
             <w:color w:val="0000EE"/>
             <w:u w:val="single"/>
           </w:rPr>
-          <w:t>2 Kgs 8:20–22</w:t>
+          <w:t>2 Kings 8:20–22</w:t>
         </w:r>
       </w:hyperlink>
       <w:r>
         <w:rPr>
           <w:lang w:val="en_US" w:bidi="en_US"/>
         </w:rPr>
-        <w:t xml:space="preserve">; cp. </w:t>
+        <w:t xml:space="preserve">; compare </w:t>
       </w:r>
       <w:hyperlink r:id="rId17">
         <w:r>
@@ -339,27 +367,14 @@
             <w:color w:val="0000EE"/>
             <w:u w:val="single"/>
           </w:rPr>
-          <w:t>2 Kgs 3:9–14</w:t>
+          <w:t>2 Kings 3:9–14</w:t>
         </w:r>
       </w:hyperlink>
       <w:r>
         <w:rPr>
           <w:lang w:val="en_US" w:bidi="en_US"/>
         </w:rPr>
-        <w:t xml:space="preserve">). Edom was probably infiltrated and supplanted by Arab kingdoms around 600–400 BC. In postexilic and New Testament times, Edom resurfaced in southern Judah under the Greek name </w:t>
-      </w:r>
-      <w:r>
-        <w:rPr>
-          <w:i/>
-          <w:lang w:val="en_US" w:bidi="en_US"/>
-        </w:rPr>
-        <w:t>Idumea,</w:t>
-      </w:r>
-      <w:r>
-        <w:rPr>
-          <w:lang w:val="en_US" w:bidi="en_US"/>
-        </w:rPr>
-        <w:t xml:space="preserve"> whose most infamous citizen was Herod the Great, the self-styled “King of the Jews.”</w:t>
+        <w:t xml:space="preserve">). </w:t>
       </w:r>
     </w:p>
     <w:p>
@@ -373,7 +388,21 @@
         <w:rPr>
           <w:lang w:val="en_US" w:bidi="en_US"/>
         </w:rPr>
-        <w:t>As a nation, Edom replayed Esau’s original animosity toward Jacob. For example, Edom opposed Israel’s exodus from Egypt (</w:t>
+        <w:t>Around 600–400 BC, Arab kingdoms likely moved into Edom and took control of the land. After the exile and into New Testament times, Edom appeared again in southern Judah. It was then called Idumea (the Greek name for Edom). One well-known person from this region was Herod the Great, who called himself the "King of the Jews."</w:t>
+      </w:r>
+    </w:p>
+    <w:p>
+      <w:pPr/>
+      <w:r>
+        <w:rPr>
+          <w:lang w:val="en_US" w:bidi="en_US"/>
+        </w:rPr>
+      </w:r>
+      <w:r>
+        <w:rPr>
+          <w:lang w:val="en_US" w:bidi="en_US"/>
+        </w:rPr>
+        <w:t>As a nation, Edom repeated Esau’s earlier hatred toward Jacob. For example, Edom refused to help Israel during the exodus from Egypt and blocked their way (</w:t>
       </w:r>
       <w:hyperlink r:id="rId18">
         <w:r>
@@ -384,7 +413,7 @@
             <w:color w:val="0000EE"/>
             <w:u w:val="single"/>
           </w:rPr>
-          <w:t>Num 20:14–21</w:t>
+          <w:t>Numbers 20:14–21</w:t>
         </w:r>
       </w:hyperlink>
       <w:r>
@@ -409,18 +438,7 @@
         <w:rPr>
           <w:lang w:val="en_US" w:bidi="en_US"/>
         </w:rPr>
-        <w:t>). Much later, when the kingdom of Judah was attacked and taken into exile by the Babylonians, Edom not only rejoiced in the event but also sided with the Babylonians against Israel, seeking to enrich themselves. This infidelity toward their “brother” Israel prompted Obadiah’s prophecy.</w:t>
-      </w:r>
-    </w:p>
-    <w:p>
-      <w:pPr>
-        <w:pStyle w:val="Heading2"/>
-      </w:pPr>
-      <w:r>
-        <w:rPr>
-          <w:lang w:val="en_US" w:bidi="en_US"/>
-        </w:rPr>
-        <w:t>Summary</w:t>
+        <w:t xml:space="preserve">). </w:t>
       </w:r>
     </w:p>
     <w:p>
@@ -434,7 +452,7 @@
         <w:rPr>
           <w:lang w:val="en_US" w:bidi="en_US"/>
         </w:rPr>
-        <w:t>Obadiah is built around two related themes: the destruction of Edom, and the vindication and restoration of Judah.</w:t>
+        <w:t>Much later, the Babylonians attacked Judah and took the people into exile (forced removal from their land). At that time, Edom did not help Judah. Instead, they rejoiced and supported Babylon. They also tried to gain wealth from Judah’s fall.</w:t>
       </w:r>
     </w:p>
     <w:p>
@@ -448,7 +466,46 @@
         <w:rPr>
           <w:lang w:val="en_US" w:bidi="en_US"/>
         </w:rPr>
-        <w:t>In Obadiah’s introduction (</w:t>
+        <w:t>This unfaithfulness toward their “brother” Israel led to the message of the prophet Obadiah.</w:t>
+      </w:r>
+    </w:p>
+    <w:p>
+      <w:pPr>
+        <w:pStyle w:val="Heading2"/>
+      </w:pPr>
+      <w:r>
+        <w:rPr>
+          <w:lang w:val="en_US" w:bidi="en_US"/>
+        </w:rPr>
+        <w:t>Summary</w:t>
+      </w:r>
+    </w:p>
+    <w:p>
+      <w:pPr/>
+      <w:r>
+        <w:rPr>
+          <w:lang w:val="en_US" w:bidi="en_US"/>
+        </w:rPr>
+      </w:r>
+      <w:r>
+        <w:rPr>
+          <w:lang w:val="en_US" w:bidi="en_US"/>
+        </w:rPr>
+        <w:t>The book of Obadiah has two main themes: the destruction of Edom and the restoration (bringing back and healing) of Judah.</w:t>
+      </w:r>
+    </w:p>
+    <w:p>
+      <w:pPr/>
+      <w:r>
+        <w:rPr>
+          <w:lang w:val="en_US" w:bidi="en_US"/>
+        </w:rPr>
+      </w:r>
+      <w:r>
+        <w:rPr>
+          <w:lang w:val="en_US" w:bidi="en_US"/>
+        </w:rPr>
+        <w:t>In the introduction (</w:t>
       </w:r>
       <w:hyperlink r:id="rId20">
         <w:r>
@@ -466,7 +523,7 @@
         <w:rPr>
           <w:lang w:val="en_US" w:bidi="en_US"/>
         </w:rPr>
-        <w:t>), a messenger is sent to call the nations to battle against Edom, and Edom’s judgment is announced. The overthrow of Edom would completely destroy the pride of this nation that was secure in its physical location and its intellectual achievements.</w:t>
+        <w:t>), a messenger calls the nations to attack Edom. God announces judgment against Edom. This judgment will destroy Edom’s pride. The people trusted in their strong mountain location and in their wisdom, but these would not save them.</w:t>
       </w:r>
     </w:p>
     <w:p>
@@ -480,7 +537,7 @@
         <w:rPr>
           <w:lang w:val="en_US" w:bidi="en_US"/>
         </w:rPr>
-        <w:t>The second section (</w:t>
+        <w:t>In the second section (</w:t>
       </w:r>
       <w:hyperlink r:id="rId21">
         <w:r>
@@ -498,7 +555,7 @@
         <w:rPr>
           <w:lang w:val="en_US" w:bidi="en_US"/>
         </w:rPr>
-        <w:t>) gives the reasons for Edom’s humiliation in a series of taunts. The errant nation had a duty to its brother Jacob that it not only ignored but actively repudiated.</w:t>
+        <w:t>), Obadiah explains why Edom will be punished. He lists their wrong actions in a series of sharp statements (taunts, meaning words that expose and shame wrongdoing). Edom had a duty to help their “brother” Jacob (Israel). Instead, they turned against them and refused to help.</w:t>
       </w:r>
     </w:p>
     <w:p>
@@ -530,7 +587,7 @@
         <w:rPr>
           <w:lang w:val="en_US" w:bidi="en_US"/>
         </w:rPr>
-        <w:t>), Obadiah envisions a coming day of the Lord that will culminate in a universal Kingdom belonging to God. Those who do evil will suffer terrible consequences (</w:t>
+        <w:t>), Obadiah describes the coming “Day of the LORD” (a time when God judges evil and sets things right). Those who do evil will face serious consequences (</w:t>
       </w:r>
       <w:hyperlink r:id="rId23">
         <w:r>
@@ -548,7 +605,7 @@
         <w:rPr>
           <w:lang w:val="en_US" w:bidi="en_US"/>
         </w:rPr>
-        <w:t>), and those who have suffered unjustly will be restored (</w:t>
+        <w:t>). Those who have suffered unfairly will be restored (</w:t>
       </w:r>
       <w:hyperlink r:id="rId24">
         <w:r>
@@ -566,18 +623,7 @@
         <w:rPr>
           <w:lang w:val="en_US" w:bidi="en_US"/>
         </w:rPr>
-        <w:t>). The people of Jerusalem will repossess the land inherited from their forefathers and will spill over their borders in every direction. Their nemesis, Edom, will be subjugated as an example of what happens to those who oppose the Lord’s rule, and the whole world will recognize the Lord as King.</w:t>
-      </w:r>
-    </w:p>
-    <w:p>
-      <w:pPr>
-        <w:pStyle w:val="Heading2"/>
-      </w:pPr>
-      <w:r>
-        <w:rPr>
-          <w:lang w:val="en_US" w:bidi="en_US"/>
-        </w:rPr>
-        <w:t>Authorship and Date</w:t>
+        <w:t xml:space="preserve">). </w:t>
       </w:r>
     </w:p>
     <w:p>
@@ -591,7 +637,32 @@
         <w:rPr>
           <w:lang w:val="en_US" w:bidi="en_US"/>
         </w:rPr>
-        <w:t>Obadiah’s name means “servant of the Lord.” He is known only from his prophecy and from clues that the text provides as to his time and place. Several individuals in Old Testament Israel were named Obadiah, including King Ahab’s palace supervisor at an earlier time (</w:t>
+        <w:t>The people of Jerusalem will return and take back their land. Their territory will grow in every direction. Edom will be brought under their rule as an example of what happens to those who oppose the Lord. In the end, the whole world will recognize the Lord as King.</w:t>
+      </w:r>
+    </w:p>
+    <w:p>
+      <w:pPr>
+        <w:pStyle w:val="Heading2"/>
+      </w:pPr>
+      <w:r>
+        <w:rPr>
+          <w:lang w:val="en_US" w:bidi="en_US"/>
+        </w:rPr>
+        <w:t>Author and Date</w:t>
+      </w:r>
+    </w:p>
+    <w:p>
+      <w:pPr/>
+      <w:r>
+        <w:rPr>
+          <w:lang w:val="en_US" w:bidi="en_US"/>
+        </w:rPr>
+      </w:r>
+      <w:r>
+        <w:rPr>
+          <w:lang w:val="en_US" w:bidi="en_US"/>
+        </w:rPr>
+        <w:t>Obadiah’s name means “servant of the Lord.” We know about him only from this book and from clues in the text about his time and place. Several people in the Old Testament were named Obadiah. One example is a palace official who served King Ahab (</w:t>
       </w:r>
       <w:hyperlink r:id="rId25">
         <w:r>
@@ -602,7 +673,7 @@
             <w:color w:val="0000EE"/>
             <w:u w:val="single"/>
           </w:rPr>
-          <w:t>1 Kgs 18:3–16</w:t>
+          <w:t>1 Kings 18:3–16</w:t>
         </w:r>
       </w:hyperlink>
       <w:r>
@@ -623,7 +694,7 @@
         <w:rPr>
           <w:lang w:val="en_US" w:bidi="en_US"/>
         </w:rPr>
-        <w:t>Obadiah’s prophecy was motivated by the invasion of the kingdom of Judah. In 586 BC, the Babylonian king Nebuchadnezzar terminated Judah’s independence and exiled its last king, Zedekiah (</w:t>
+        <w:t>Obadiah gave his message after the kingdom of Judah was invaded. In 586 BC, the Babylonian king Nebuchadnezzar ended Judah’s independence. He destroyed Jerusalem and took the last king, Zedekiah, into exile (</w:t>
       </w:r>
       <w:hyperlink r:id="rId26">
         <w:r>
@@ -634,14 +705,28 @@
             <w:color w:val="0000EE"/>
             <w:u w:val="single"/>
           </w:rPr>
-          <w:t>2 Kgs 25:1–30</w:t>
+          <w:t>2 Kings 25:1–30</w:t>
         </w:r>
       </w:hyperlink>
       <w:r>
         <w:rPr>
           <w:lang w:val="en_US" w:bidi="en_US"/>
         </w:rPr>
-        <w:t xml:space="preserve">). Outside of the book of Obadiah, there is little reference to Edom’s specific response to this event (see also </w:t>
+        <w:t xml:space="preserve">). </w:t>
+      </w:r>
+    </w:p>
+    <w:p>
+      <w:pPr/>
+      <w:r>
+        <w:rPr>
+          <w:lang w:val="en_US" w:bidi="en_US"/>
+        </w:rPr>
+      </w:r>
+      <w:r>
+        <w:rPr>
+          <w:lang w:val="en_US" w:bidi="en_US"/>
+        </w:rPr>
+        <w:t xml:space="preserve">Outside the book of Obadiah, the Bible says little about how Edom responded to this event (see also </w:t>
       </w:r>
       <w:hyperlink r:id="rId27">
         <w:r>
@@ -652,14 +737,14 @@
             <w:color w:val="0000EE"/>
             <w:u w:val="single"/>
           </w:rPr>
-          <w:t>Isa 34:5–10</w:t>
+          <w:t>Isaiah 34:5–10</w:t>
         </w:r>
       </w:hyperlink>
       <w:r>
         <w:rPr>
           <w:lang w:val="en_US" w:bidi="en_US"/>
         </w:rPr>
-        <w:t>). Obadiah probably wrote his prophecy shortly after Jerusalem was destroyed in 586 BC.</w:t>
+        <w:t>). Obadiah likely wrote his prophecy soon after Babylon destroyed Jerusalem in 586 BC.</w:t>
       </w:r>
     </w:p>
     <w:p>
@@ -684,7 +769,7 @@
         <w:rPr>
           <w:lang w:val="en_US" w:bidi="en_US"/>
         </w:rPr>
-        <w:t xml:space="preserve">Obadiah’s message about Edom echoes that of other prophets, and parts of it closely follow </w:t>
+        <w:t xml:space="preserve">Obadiah’s message about Edom is similar to the messages of other prophets. Parts of his prophecy closely match </w:t>
       </w:r>
       <w:hyperlink r:id="rId28">
         <w:r>
@@ -720,7 +805,7 @@
         <w:rPr>
           <w:lang w:val="en_US" w:bidi="en_US"/>
         </w:rPr>
-        <w:t xml:space="preserve">. It should probably be read in conjunction with other prophecies regarding Edom’s future and may even function as an expansion of such passages as </w:t>
+        <w:t xml:space="preserve">. For this reason, it is helpful to study Obadiah alongside other prophecies about Edom’s future. His message may also expand on shorter passages such as </w:t>
       </w:r>
       <w:hyperlink r:id="rId30">
         <w:r>
@@ -781,7 +866,7 @@
         <w:rPr>
           <w:lang w:val="en_US" w:bidi="en_US"/>
         </w:rPr>
-        <w:t>On first reading, it is easy to regard Obadiah’s prophecy as little more than a prophetic tirade in which the Lord’s wrath is directed toward Israel’s enemies. The Lord’s wrath is real, and evil does not go unpunished, but the book has far more to say than this.</w:t>
+        <w:t>At first, Obadiah’s prophecy may seem like a harsh message about the Lord’s anger against Israel’s enemies. The Lord’s anger is real, and evil will not go unpunished. But this short book has a deeper message than this simple view.</w:t>
       </w:r>
     </w:p>
     <w:p>
@@ -795,7 +880,21 @@
         <w:rPr>
           <w:lang w:val="en_US" w:bidi="en_US"/>
         </w:rPr>
-        <w:t>Nations, like individuals, should attend carefully to what they plant, because the time of harvest will quickly come. God is offended by wrongdoing, and he brings justice for the oppressed. What Edom did to Judah, whether actively or passively, would rebound on them according to the ancient law of retribution (</w:t>
+        <w:t>Nations, like individuals, should think carefully about what they do, because the results will come soon. God is offended by wrongdoing, and he brings justice for people who are harmed or treated unfairly (the oppressed).</w:t>
+      </w:r>
+    </w:p>
+    <w:p>
+      <w:pPr/>
+      <w:r>
+        <w:rPr>
+          <w:lang w:val="en_US" w:bidi="en_US"/>
+        </w:rPr>
+      </w:r>
+      <w:r>
+        <w:rPr>
+          <w:lang w:val="en_US" w:bidi="en_US"/>
+        </w:rPr>
+        <w:t xml:space="preserve">What Edom did to Judah, whether by action or by doing nothing, would come back on them. This follows an ancient law of justice called </w:t>
       </w:r>
       <w:r>
         <w:rPr>
@@ -808,7 +907,19 @@
         <w:rPr>
           <w:lang w:val="en_US" w:bidi="en_US"/>
         </w:rPr>
-        <w:t>): “As you have done . . . so it will be done to you” (</w:t>
+        <w:t xml:space="preserve"> (a Latin phrase meaning “the law of equal response”). It means that a person receives the same kind of action they have done: "</w:t>
+      </w:r>
+      <w:r>
+        <w:rPr>
+          <w:lang w:val="en_US" w:bidi="en_US"/>
+        </w:rPr>
+        <w:t>As you have done, it will be done to you</w:t>
+      </w:r>
+      <w:r>
+        <w:rPr>
+          <w:lang w:val="en_US" w:bidi="en_US"/>
+        </w:rPr>
+        <w:t>" (</w:t>
       </w:r>
       <w:hyperlink r:id="rId32">
         <w:r>
@@ -840,7 +951,21 @@
         <w:rPr>
           <w:lang w:val="en_US" w:bidi="en_US"/>
         </w:rPr>
-        <w:t>The day of the Lord will break in, bringing full justice to the oppressed, punishment to the oppressors, and the onset of a universal kingdom in which the Lord rules over all nations. On a local and historical level, this meant that Israel would be restored to her land and given sovereignty over the lands of Edom. On a universal level, Edom’s punishment was only part of a larger scenario of judgment. Not just Edom, but “all . . . nations” (</w:t>
+        <w:t>"The Day of the LORD" will come suddenly. It will bring full justice for those who have suffered, punishment for those who do wrong, and the beginning of a kingdom where the Lord rules over all nations.</w:t>
+      </w:r>
+    </w:p>
+    <w:p>
+      <w:pPr/>
+      <w:r>
+        <w:rPr>
+          <w:lang w:val="en_US" w:bidi="en_US"/>
+        </w:rPr>
+      </w:r>
+      <w:r>
+        <w:rPr>
+          <w:lang w:val="en_US" w:bidi="en_US"/>
+        </w:rPr>
+        <w:t>In the near (historical) sense, this meant that Israel would return to their land and rule over the land of Edom. But in a wider (universal) sense, Edom’s punishment is only part of a larger judgment. Not only Edom, but all nations will face the Lord's judgment (</w:t>
       </w:r>
       <w:hyperlink r:id="rId33">
         <w:r>
@@ -858,7 +983,7 @@
         <w:rPr>
           <w:lang w:val="en_US" w:bidi="en_US"/>
         </w:rPr>
-        <w:t>) will drink the cup of the Lord’s wrath. When the Lord returns as King to a restored Jerusalem, Mount Zion will be at the very center of the new order.</w:t>
+        <w:t xml:space="preserve">). </w:t>
       </w:r>
     </w:p>
     <w:p>
@@ -872,7 +997,47 @@
         <w:rPr>
           <w:lang w:val="en_US" w:bidi="en_US"/>
         </w:rPr>
-        <w:t>This picture of God dominates Obadiah’s theology and forces modern readers to face a decision. Whom will we serve—a god who is indifferent to evil, or the God of justice that we find in Obadiah? Only a God who judges evil can reassure us that evil will not ultimately triumph. Obadiah looks forward to that new day when “the Lord himself will be king” (</w:t>
+        <w:t>When the Lord comes as King and restores Jerusalem, Mount Zion (the hill in Jerusalem where the temple stood) will be at the center of this new order.</w:t>
+      </w:r>
+    </w:p>
+    <w:p>
+      <w:pPr/>
+      <w:r>
+        <w:rPr>
+          <w:lang w:val="en_US" w:bidi="en_US"/>
+        </w:rPr>
+      </w:r>
+      <w:r>
+        <w:rPr>
+          <w:lang w:val="en_US" w:bidi="en_US"/>
+        </w:rPr>
+        <w:t>This view of God is central to the message of Obadiah. It calls all people today to make a choice. Who will we serve? Will we serve a god who ignores evil, or the God of justice shown in Obadiah? Only a God who judges evil can give us confidence that evil will not win in the end.</w:t>
+      </w:r>
+    </w:p>
+    <w:p>
+      <w:pPr/>
+      <w:r>
+        <w:rPr>
+          <w:lang w:val="en_US" w:bidi="en_US"/>
+        </w:rPr>
+      </w:r>
+      <w:r>
+        <w:rPr>
+          <w:lang w:val="en_US" w:bidi="en_US"/>
+        </w:rPr>
+        <w:t>Obadiah anticipates a new time when “</w:t>
+      </w:r>
+      <w:r>
+        <w:rPr>
+          <w:lang w:val="en_US" w:bidi="en_US"/>
+        </w:rPr>
+        <w:t>the kingdom will belong to the LORD</w:t>
+      </w:r>
+      <w:r>
+        <w:rPr>
+          <w:lang w:val="en_US" w:bidi="en_US"/>
+        </w:rPr>
+        <w:t>” (</w:t>
       </w:r>
       <w:hyperlink r:id="rId34">
         <w:r>
@@ -890,7 +1055,19 @@
         <w:rPr>
           <w:lang w:val="en_US" w:bidi="en_US"/>
         </w:rPr>
-        <w:t>). This hope of Israel became the hope of the whole world when Christ announced, “The Kingdom of God is near” (</w:t>
+        <w:t>). This hope first belonged to Israel, but it later became a hope for the whole world. Jesus announced this same hope when he said, “</w:t>
+      </w:r>
+      <w:r>
+        <w:rPr>
+          <w:lang w:val="en_US" w:bidi="en_US"/>
+        </w:rPr>
+        <w:t>the kingdom of God is near</w:t>
+      </w:r>
+      <w:r>
+        <w:rPr>
+          <w:lang w:val="en_US" w:bidi="en_US"/>
+        </w:rPr>
+        <w:t>” (</w:t>
       </w:r>
       <w:hyperlink r:id="rId35">
         <w:r>

</xml_diff>